<commit_message>
Remove outdated README from Scrapping_manual_ hybrid folder
</commit_message>
<xml_diff>
--- a/Week1_ Data Collection & Curation/Week1_Report.docx
+++ b/Week1_ Data Collection & Curation/Week1_Report.docx
@@ -288,21 +288,7 @@
         <w:rPr>
           <w:rFonts w:ascii="Times New Roman" w:hAnsi="Times New Roman" w:cs="Times New Roman"/>
         </w:rPr>
-        <w:t xml:space="preserve">, Source, Date, and Metadata. The dataset contained </w:t>
-      </w:r>
-      <w:r>
-        <w:rPr>
-          <w:rFonts w:ascii="Times New Roman" w:hAnsi="Times New Roman" w:cs="Times New Roman"/>
-          <w:b/>
-          <w:bCs/>
-        </w:rPr>
-        <w:t>1,178 distinct sources</w:t>
-      </w:r>
-      <w:r>
-        <w:rPr>
-          <w:rFonts w:ascii="Times New Roman" w:hAnsi="Times New Roman" w:cs="Times New Roman"/>
-        </w:rPr>
-        <w:t>, including government websites, media wires, NGOs, and official corpora.</w:t>
+        <w:t xml:space="preserve">, Source, Date, and Metadata. </w:t>
       </w:r>
     </w:p>
     <w:p>
@@ -508,8 +494,14 @@
         <w:rPr>
           <w:rFonts w:ascii="Times New Roman" w:hAnsi="Times New Roman" w:cs="Times New Roman"/>
         </w:rPr>
+        <w:t xml:space="preserve">This approach allowed the team to expand the available training data while reducing the risk of generating completely unrelated or unrealistic PSA messages. The final project documentation </w:t>
+      </w:r>
+      <w:r>
+        <w:rPr>
+          <w:rFonts w:ascii="Times New Roman" w:hAnsi="Times New Roman" w:cs="Times New Roman"/>
+        </w:rPr>
         <w:lastRenderedPageBreak/>
-        <w:t xml:space="preserve">This approach allowed the team to expand the available training data while reducing the risk of generating completely unrelated or unrealistic PSA messages. The final project documentation records a </w:t>
+        <w:t xml:space="preserve">records a </w:t>
       </w:r>
       <w:r>
         <w:rPr>
@@ -1224,9 +1216,8 @@
         <w:tblLook w:val="04A0" w:firstRow="1" w:lastRow="0" w:firstColumn="1" w:lastColumn="0" w:noHBand="0" w:noVBand="1"/>
       </w:tblPr>
       <w:tblGrid>
-        <w:gridCol w:w="644"/>
-        <w:gridCol w:w="1167"/>
-        <w:gridCol w:w="7549"/>
+        <w:gridCol w:w="667"/>
+        <w:gridCol w:w="8693"/>
       </w:tblGrid>
       <w:tr>
         <w:trPr>
@@ -1254,30 +1245,6 @@
                 <w:bCs/>
               </w:rPr>
               <w:t>PSA ID</w:t>
-            </w:r>
-          </w:p>
-        </w:tc>
-        <w:tc>
-          <w:tcPr>
-            <w:tcW w:w="0" w:type="auto"/>
-            <w:vAlign w:val="center"/>
-            <w:hideMark/>
-          </w:tcPr>
-          <w:p>
-            <w:pPr>
-              <w:rPr>
-                <w:rFonts w:ascii="Times New Roman" w:hAnsi="Times New Roman" w:cs="Times New Roman"/>
-                <w:b/>
-                <w:bCs/>
-              </w:rPr>
-            </w:pPr>
-            <w:r>
-              <w:rPr>
-                <w:rFonts w:ascii="Times New Roman" w:hAnsi="Times New Roman" w:cs="Times New Roman"/>
-                <w:b/>
-                <w:bCs/>
-              </w:rPr>
-              <w:t>Domain</w:t>
             </w:r>
           </w:p>
         </w:tc>
@@ -1346,26 +1313,6 @@
               <w:rPr>
                 <w:rFonts w:ascii="Times New Roman" w:hAnsi="Times New Roman" w:cs="Times New Roman"/>
               </w:rPr>
-              <w:t>Agriculture</w:t>
-            </w:r>
-          </w:p>
-        </w:tc>
-        <w:tc>
-          <w:tcPr>
-            <w:tcW w:w="0" w:type="auto"/>
-            <w:vAlign w:val="center"/>
-            <w:hideMark/>
-          </w:tcPr>
-          <w:p>
-            <w:pPr>
-              <w:rPr>
-                <w:rFonts w:ascii="Times New Roman" w:hAnsi="Times New Roman" w:cs="Times New Roman"/>
-              </w:rPr>
-            </w:pPr>
-            <w:r>
-              <w:rPr>
-                <w:rFonts w:ascii="Times New Roman" w:hAnsi="Times New Roman" w:cs="Times New Roman"/>
-              </w:rPr>
               <w:t xml:space="preserve">Farmers are urged to prioritize safe agrochemical usage as Kenya hosts the World Farmers' </w:t>
             </w:r>
             <w:proofErr w:type="spellStart"/>
@@ -1425,26 +1372,6 @@
               <w:rPr>
                 <w:rFonts w:ascii="Times New Roman" w:hAnsi="Times New Roman" w:cs="Times New Roman"/>
               </w:rPr>
-              <w:t>Agriculture</w:t>
-            </w:r>
-          </w:p>
-        </w:tc>
-        <w:tc>
-          <w:tcPr>
-            <w:tcW w:w="0" w:type="auto"/>
-            <w:vAlign w:val="center"/>
-            <w:hideMark/>
-          </w:tcPr>
-          <w:p>
-            <w:pPr>
-              <w:rPr>
-                <w:rFonts w:ascii="Times New Roman" w:hAnsi="Times New Roman" w:cs="Times New Roman"/>
-              </w:rPr>
-            </w:pPr>
-            <w:r>
-              <w:rPr>
-                <w:rFonts w:ascii="Times New Roman" w:hAnsi="Times New Roman" w:cs="Times New Roman"/>
-              </w:rPr>
               <w:t>Trucks ferrying top-dressing fertilizer are now arriving at the Eldoret Depot of the National Cereals and Produce Board. Farmers are encouraged to collect their supplies.</w:t>
             </w:r>
           </w:p>
@@ -1490,26 +1417,6 @@
               <w:rPr>
                 <w:rFonts w:ascii="Times New Roman" w:hAnsi="Times New Roman" w:cs="Times New Roman"/>
               </w:rPr>
-              <w:t>Agriculture</w:t>
-            </w:r>
-          </w:p>
-        </w:tc>
-        <w:tc>
-          <w:tcPr>
-            <w:tcW w:w="0" w:type="auto"/>
-            <w:vAlign w:val="center"/>
-            <w:hideMark/>
-          </w:tcPr>
-          <w:p>
-            <w:pPr>
-              <w:rPr>
-                <w:rFonts w:ascii="Times New Roman" w:hAnsi="Times New Roman" w:cs="Times New Roman"/>
-              </w:rPr>
-            </w:pPr>
-            <w:r>
-              <w:rPr>
-                <w:rFonts w:ascii="Times New Roman" w:hAnsi="Times New Roman" w:cs="Times New Roman"/>
-              </w:rPr>
               <w:t xml:space="preserve">Farmers in </w:t>
             </w:r>
             <w:proofErr w:type="spellStart"/>
@@ -1583,26 +1490,6 @@
               <w:rPr>
                 <w:rFonts w:ascii="Times New Roman" w:hAnsi="Times New Roman" w:cs="Times New Roman"/>
               </w:rPr>
-              <w:t>Agriculture</w:t>
-            </w:r>
-          </w:p>
-        </w:tc>
-        <w:tc>
-          <w:tcPr>
-            <w:tcW w:w="0" w:type="auto"/>
-            <w:vAlign w:val="center"/>
-            <w:hideMark/>
-          </w:tcPr>
-          <w:p>
-            <w:pPr>
-              <w:rPr>
-                <w:rFonts w:ascii="Times New Roman" w:hAnsi="Times New Roman" w:cs="Times New Roman"/>
-              </w:rPr>
-            </w:pPr>
-            <w:r>
-              <w:rPr>
-                <w:rFonts w:ascii="Times New Roman" w:hAnsi="Times New Roman" w:cs="Times New Roman"/>
-              </w:rPr>
               <w:t>Farmers are encouraged to participate in the sugarcane ethanol initiative to help lower fuel prices and boost the sugar sector.</w:t>
             </w:r>
           </w:p>
@@ -1648,7 +1535,552 @@
               <w:rPr>
                 <w:rFonts w:ascii="Times New Roman" w:hAnsi="Times New Roman" w:cs="Times New Roman"/>
               </w:rPr>
-              <w:t>Agriculture</w:t>
+              <w:t xml:space="preserve">A </w:t>
+            </w:r>
+            <w:proofErr w:type="spellStart"/>
+            <w:r>
+              <w:rPr>
+                <w:rFonts w:ascii="Times New Roman" w:hAnsi="Times New Roman" w:cs="Times New Roman"/>
+              </w:rPr>
+              <w:t>KSh</w:t>
+            </w:r>
+            <w:proofErr w:type="spellEnd"/>
+            <w:r>
+              <w:rPr>
+                <w:rFonts w:ascii="Times New Roman" w:hAnsi="Times New Roman" w:cs="Times New Roman"/>
+              </w:rPr>
+              <w:t xml:space="preserve">. 34.4 billion </w:t>
+            </w:r>
+            <w:proofErr w:type="gramStart"/>
+            <w:r>
+              <w:rPr>
+                <w:rFonts w:ascii="Times New Roman" w:hAnsi="Times New Roman" w:cs="Times New Roman"/>
+              </w:rPr>
+              <w:t>program</w:t>
+            </w:r>
+            <w:proofErr w:type="gramEnd"/>
+            <w:r>
+              <w:rPr>
+                <w:rFonts w:ascii="Times New Roman" w:hAnsi="Times New Roman" w:cs="Times New Roman"/>
+              </w:rPr>
+              <w:t xml:space="preserve"> has been launched to enhance climate resilience, food security, and sustainable livelihoods. Stakeholders in agriculture are encouraged to participate.</w:t>
+            </w:r>
+          </w:p>
+        </w:tc>
+      </w:tr>
+    </w:tbl>
+    <w:p>
+      <w:pPr>
+        <w:rPr>
+          <w:rFonts w:ascii="Times New Roman" w:hAnsi="Times New Roman" w:cs="Times New Roman"/>
+        </w:rPr>
+      </w:pPr>
+      <w:r>
+        <w:rPr>
+          <w:rFonts w:ascii="Times New Roman" w:hAnsi="Times New Roman" w:cs="Times New Roman"/>
+        </w:rPr>
+        <w:t xml:space="preserve">These examples demonstrate the </w:t>
+      </w:r>
+      <w:r>
+        <w:rPr>
+          <w:rFonts w:ascii="Times New Roman" w:hAnsi="Times New Roman" w:cs="Times New Roman"/>
+          <w:b/>
+          <w:bCs/>
+        </w:rPr>
+        <w:t>action-oriented and public-interest nature</w:t>
+      </w:r>
+      <w:r>
+        <w:rPr>
+          <w:rFonts w:ascii="Times New Roman" w:hAnsi="Times New Roman" w:cs="Times New Roman"/>
+        </w:rPr>
+        <w:t xml:space="preserve"> of the collected messages. Similar PSA records were collected across all five target domains to provide diverse material for subsequent </w:t>
+      </w:r>
+      <w:r>
+        <w:rPr>
+          <w:rFonts w:ascii="Times New Roman" w:hAnsi="Times New Roman" w:cs="Times New Roman"/>
+          <w:b/>
+          <w:bCs/>
+        </w:rPr>
+        <w:t>data processing, synthetic data generation, translation, and machine-learning model training</w:t>
+      </w:r>
+      <w:r>
+        <w:rPr>
+          <w:rFonts w:ascii="Times New Roman" w:hAnsi="Times New Roman" w:cs="Times New Roman"/>
+        </w:rPr>
+        <w:t xml:space="preserve">. The project documentation also confirms that the merged dataset contained </w:t>
+      </w:r>
+      <w:r>
+        <w:rPr>
+          <w:rFonts w:ascii="Times New Roman" w:hAnsi="Times New Roman" w:cs="Times New Roman"/>
+          <w:b/>
+          <w:bCs/>
+        </w:rPr>
+        <w:t>6,236 real scraped records</w:t>
+      </w:r>
+      <w:r>
+        <w:rPr>
+          <w:rFonts w:ascii="Times New Roman" w:hAnsi="Times New Roman" w:cs="Times New Roman"/>
+        </w:rPr>
+        <w:t xml:space="preserve"> across these domains.</w:t>
+      </w:r>
+    </w:p>
+    <w:p>
+      <w:pPr>
+        <w:rPr>
+          <w:rFonts w:ascii="Times New Roman" w:hAnsi="Times New Roman" w:cs="Times New Roman"/>
+          <w:b/>
+          <w:bCs/>
+        </w:rPr>
+      </w:pPr>
+      <w:r>
+        <w:rPr>
+          <w:rFonts w:ascii="Times New Roman" w:hAnsi="Times New Roman" w:cs="Times New Roman"/>
+        </w:rPr>
+        <w:t xml:space="preserve">7. </w:t>
+      </w:r>
+      <w:r>
+        <w:rPr>
+          <w:rFonts w:ascii="Times New Roman" w:hAnsi="Times New Roman" w:cs="Times New Roman"/>
+          <w:b/>
+          <w:bCs/>
+        </w:rPr>
+        <w:t>Translation and Multilingual Data Preparation</w:t>
+      </w:r>
+    </w:p>
+    <w:p>
+      <w:pPr>
+        <w:rPr>
+          <w:rFonts w:ascii="Times New Roman" w:hAnsi="Times New Roman" w:cs="Times New Roman"/>
+        </w:rPr>
+      </w:pPr>
+      <w:r>
+        <w:rPr>
+          <w:rFonts w:ascii="Times New Roman" w:hAnsi="Times New Roman" w:cs="Times New Roman"/>
+        </w:rPr>
+        <w:t xml:space="preserve">After collecting and curating the PSA data, the team proceeded to develop the </w:t>
+      </w:r>
+      <w:r>
+        <w:rPr>
+          <w:rFonts w:ascii="Times New Roman" w:hAnsi="Times New Roman" w:cs="Times New Roman"/>
+          <w:b/>
+          <w:bCs/>
+        </w:rPr>
+        <w:t>multilingual component</w:t>
+      </w:r>
+      <w:r>
+        <w:rPr>
+          <w:rFonts w:ascii="Times New Roman" w:hAnsi="Times New Roman" w:cs="Times New Roman"/>
+        </w:rPr>
+        <w:t xml:space="preserve"> of the dataset. The initial scraped dataset contained English PSAs together with Kiswahili translations for a substantial proportion of the records, while the availability of </w:t>
+      </w:r>
+      <w:proofErr w:type="spellStart"/>
+      <w:r>
+        <w:rPr>
+          <w:rFonts w:ascii="Times New Roman" w:hAnsi="Times New Roman" w:cs="Times New Roman"/>
+        </w:rPr>
+        <w:t>Ekegusii</w:t>
+      </w:r>
+      <w:proofErr w:type="spellEnd"/>
+      <w:r>
+        <w:rPr>
+          <w:rFonts w:ascii="Times New Roman" w:hAnsi="Times New Roman" w:cs="Times New Roman"/>
+        </w:rPr>
+        <w:t xml:space="preserve"> and other indigenous-language translations was limited.</w:t>
+      </w:r>
+    </w:p>
+    <w:p>
+      <w:pPr>
+        <w:rPr>
+          <w:rFonts w:ascii="Times New Roman" w:hAnsi="Times New Roman" w:cs="Times New Roman"/>
+        </w:rPr>
+      </w:pPr>
+      <w:r>
+        <w:rPr>
+          <w:rFonts w:ascii="Times New Roman" w:hAnsi="Times New Roman" w:cs="Times New Roman"/>
+        </w:rPr>
+        <w:t xml:space="preserve">To increase the availability of </w:t>
+      </w:r>
+      <w:proofErr w:type="spellStart"/>
+      <w:r>
+        <w:rPr>
+          <w:rFonts w:ascii="Times New Roman" w:hAnsi="Times New Roman" w:cs="Times New Roman"/>
+        </w:rPr>
+        <w:t>Ekegusii</w:t>
+      </w:r>
+      <w:proofErr w:type="spellEnd"/>
+      <w:r>
+        <w:rPr>
+          <w:rFonts w:ascii="Times New Roman" w:hAnsi="Times New Roman" w:cs="Times New Roman"/>
+        </w:rPr>
+        <w:t xml:space="preserve"> data, the team used the collected and expanded PSA dataset as the source material for </w:t>
+      </w:r>
+      <w:r>
+        <w:rPr>
+          <w:rFonts w:ascii="Times New Roman" w:hAnsi="Times New Roman" w:cs="Times New Roman"/>
+          <w:b/>
+          <w:bCs/>
+        </w:rPr>
+        <w:t>English-to-</w:t>
+      </w:r>
+      <w:proofErr w:type="spellStart"/>
+      <w:r>
+        <w:rPr>
+          <w:rFonts w:ascii="Times New Roman" w:hAnsi="Times New Roman" w:cs="Times New Roman"/>
+          <w:b/>
+          <w:bCs/>
+        </w:rPr>
+        <w:t>Ekegusii</w:t>
+      </w:r>
+      <w:proofErr w:type="spellEnd"/>
+      <w:r>
+        <w:rPr>
+          <w:rFonts w:ascii="Times New Roman" w:hAnsi="Times New Roman" w:cs="Times New Roman"/>
+          <w:b/>
+          <w:bCs/>
+        </w:rPr>
+        <w:t xml:space="preserve"> translation</w:t>
+      </w:r>
+      <w:r>
+        <w:rPr>
+          <w:rFonts w:ascii="Times New Roman" w:hAnsi="Times New Roman" w:cs="Times New Roman"/>
+        </w:rPr>
+        <w:t xml:space="preserve">. An </w:t>
+      </w:r>
+      <w:r>
+        <w:rPr>
+          <w:rFonts w:ascii="Times New Roman" w:hAnsi="Times New Roman" w:cs="Times New Roman"/>
+          <w:b/>
+          <w:bCs/>
+        </w:rPr>
+        <w:t>LLM-based translation approach using few-shot prompting</w:t>
+      </w:r>
+      <w:r>
+        <w:rPr>
+          <w:rFonts w:ascii="Times New Roman" w:hAnsi="Times New Roman" w:cs="Times New Roman"/>
+        </w:rPr>
+        <w:t xml:space="preserve"> was applied to generate </w:t>
+      </w:r>
+      <w:proofErr w:type="spellStart"/>
+      <w:r>
+        <w:rPr>
+          <w:rFonts w:ascii="Times New Roman" w:hAnsi="Times New Roman" w:cs="Times New Roman"/>
+        </w:rPr>
+        <w:t>Ekegusii</w:t>
+      </w:r>
+      <w:proofErr w:type="spellEnd"/>
+      <w:r>
+        <w:rPr>
+          <w:rFonts w:ascii="Times New Roman" w:hAnsi="Times New Roman" w:cs="Times New Roman"/>
+        </w:rPr>
+        <w:t xml:space="preserve"> translations. The few-shot approach was used to provide the translation model with examples and context appropriate to the PSA domain and the </w:t>
+      </w:r>
+      <w:proofErr w:type="spellStart"/>
+      <w:r>
+        <w:rPr>
+          <w:rFonts w:ascii="Times New Roman" w:hAnsi="Times New Roman" w:cs="Times New Roman"/>
+        </w:rPr>
+        <w:t>Ekegusii</w:t>
+      </w:r>
+      <w:proofErr w:type="spellEnd"/>
+      <w:r>
+        <w:rPr>
+          <w:rFonts w:ascii="Times New Roman" w:hAnsi="Times New Roman" w:cs="Times New Roman"/>
+        </w:rPr>
+        <w:t xml:space="preserve"> language.</w:t>
+      </w:r>
+    </w:p>
+    <w:p>
+      <w:pPr>
+        <w:rPr>
+          <w:rFonts w:ascii="Times New Roman" w:hAnsi="Times New Roman" w:cs="Times New Roman"/>
+        </w:rPr>
+      </w:pPr>
+      <w:r>
+        <w:rPr>
+          <w:rFonts w:ascii="Times New Roman" w:hAnsi="Times New Roman" w:cs="Times New Roman"/>
+        </w:rPr>
+        <w:t xml:space="preserve">The generated </w:t>
+      </w:r>
+      <w:proofErr w:type="spellStart"/>
+      <w:r>
+        <w:rPr>
+          <w:rFonts w:ascii="Times New Roman" w:hAnsi="Times New Roman" w:cs="Times New Roman"/>
+        </w:rPr>
+        <w:t>Ekegusii</w:t>
+      </w:r>
+      <w:proofErr w:type="spellEnd"/>
+      <w:r>
+        <w:rPr>
+          <w:rFonts w:ascii="Times New Roman" w:hAnsi="Times New Roman" w:cs="Times New Roman"/>
+        </w:rPr>
+        <w:t xml:space="preserve"> translations were then subjected to </w:t>
+      </w:r>
+      <w:r>
+        <w:rPr>
+          <w:rFonts w:ascii="Times New Roman" w:hAnsi="Times New Roman" w:cs="Times New Roman"/>
+          <w:b/>
+          <w:bCs/>
+        </w:rPr>
+        <w:t xml:space="preserve">manual validation by </w:t>
+      </w:r>
+      <w:proofErr w:type="spellStart"/>
+      <w:r>
+        <w:rPr>
+          <w:rFonts w:ascii="Times New Roman" w:hAnsi="Times New Roman" w:cs="Times New Roman"/>
+          <w:b/>
+          <w:bCs/>
+        </w:rPr>
+        <w:t>Ekegusii</w:t>
+      </w:r>
+      <w:proofErr w:type="spellEnd"/>
+      <w:r>
+        <w:rPr>
+          <w:rFonts w:ascii="Times New Roman" w:hAnsi="Times New Roman" w:cs="Times New Roman"/>
+          <w:b/>
+          <w:bCs/>
+        </w:rPr>
+        <w:t xml:space="preserve"> speakers</w:t>
+      </w:r>
+      <w:r>
+        <w:rPr>
+          <w:rFonts w:ascii="Times New Roman" w:hAnsi="Times New Roman" w:cs="Times New Roman"/>
+        </w:rPr>
+        <w:t xml:space="preserve">. This step was important because automated evaluation resources for </w:t>
+      </w:r>
+      <w:proofErr w:type="spellStart"/>
+      <w:r>
+        <w:rPr>
+          <w:rFonts w:ascii="Times New Roman" w:hAnsi="Times New Roman" w:cs="Times New Roman"/>
+        </w:rPr>
+        <w:t>Ekegusii</w:t>
+      </w:r>
+      <w:proofErr w:type="spellEnd"/>
+      <w:r>
+        <w:rPr>
+          <w:rFonts w:ascii="Times New Roman" w:hAnsi="Times New Roman" w:cs="Times New Roman"/>
+        </w:rPr>
+        <w:t xml:space="preserve"> are limited. Native-speaker review was therefore used to check </w:t>
+      </w:r>
+      <w:r>
+        <w:rPr>
+          <w:rFonts w:ascii="Times New Roman" w:hAnsi="Times New Roman" w:cs="Times New Roman"/>
+          <w:b/>
+          <w:bCs/>
+        </w:rPr>
+        <w:t>linguistic accuracy, meaning, cultural appropriateness, and consistency</w:t>
+      </w:r>
+      <w:r>
+        <w:rPr>
+          <w:rFonts w:ascii="Times New Roman" w:hAnsi="Times New Roman" w:cs="Times New Roman"/>
+        </w:rPr>
+        <w:t xml:space="preserve"> of the translations.</w:t>
+      </w:r>
+    </w:p>
+    <w:p>
+      <w:pPr>
+        <w:rPr>
+          <w:rFonts w:ascii="Times New Roman" w:hAnsi="Times New Roman" w:cs="Times New Roman"/>
+        </w:rPr>
+      </w:pPr>
+      <w:r>
+        <w:rPr>
+          <w:rFonts w:ascii="Times New Roman" w:hAnsi="Times New Roman" w:cs="Times New Roman"/>
+        </w:rPr>
+        <w:t>The resulting workflow can therefore be summarized as:</w:t>
+      </w:r>
+    </w:p>
+    <w:p>
+      <w:pPr>
+        <w:rPr>
+          <w:rFonts w:ascii="Times New Roman" w:hAnsi="Times New Roman" w:cs="Times New Roman"/>
+        </w:rPr>
+      </w:pPr>
+      <w:r>
+        <w:rPr>
+          <w:rFonts w:ascii="Times New Roman" w:hAnsi="Times New Roman" w:cs="Times New Roman"/>
+          <w:b/>
+          <w:bCs/>
+        </w:rPr>
+        <w:t xml:space="preserve">Real PSA collection → Data cleaning → Bootstrapping/synthetic expansion → English PSA dataset → LLM few-shot translation → </w:t>
+      </w:r>
+      <w:proofErr w:type="spellStart"/>
+      <w:r>
+        <w:rPr>
+          <w:rFonts w:ascii="Times New Roman" w:hAnsi="Times New Roman" w:cs="Times New Roman"/>
+          <w:b/>
+          <w:bCs/>
+        </w:rPr>
+        <w:t>Ekegusii</w:t>
+      </w:r>
+      <w:proofErr w:type="spellEnd"/>
+      <w:r>
+        <w:rPr>
+          <w:rFonts w:ascii="Times New Roman" w:hAnsi="Times New Roman" w:cs="Times New Roman"/>
+          <w:b/>
+          <w:bCs/>
+        </w:rPr>
+        <w:t xml:space="preserve"> translation → Native-speaker validation → Multilingual dataset</w:t>
+      </w:r>
+    </w:p>
+    <w:p>
+      <w:pPr>
+        <w:rPr>
+          <w:rFonts w:ascii="Times New Roman" w:hAnsi="Times New Roman" w:cs="Times New Roman"/>
+        </w:rPr>
+      </w:pPr>
+      <w:r>
+        <w:rPr>
+          <w:rFonts w:ascii="Times New Roman" w:hAnsi="Times New Roman" w:cs="Times New Roman"/>
+        </w:rPr>
+        <w:t xml:space="preserve">This process provided the multilingual training material required for the later machine-translation experiments and supported the project's focus on </w:t>
+      </w:r>
+      <w:r>
+        <w:rPr>
+          <w:rFonts w:ascii="Times New Roman" w:hAnsi="Times New Roman" w:cs="Times New Roman"/>
+          <w:b/>
+          <w:bCs/>
+        </w:rPr>
+        <w:t xml:space="preserve">English/Kiswahili and under-resourced Kenyan languages, particularly </w:t>
+      </w:r>
+      <w:proofErr w:type="spellStart"/>
+      <w:r>
+        <w:rPr>
+          <w:rFonts w:ascii="Times New Roman" w:hAnsi="Times New Roman" w:cs="Times New Roman"/>
+          <w:b/>
+          <w:bCs/>
+        </w:rPr>
+        <w:t>Ekegusii</w:t>
+      </w:r>
+      <w:proofErr w:type="spellEnd"/>
+      <w:r>
+        <w:rPr>
+          <w:rFonts w:ascii="Times New Roman" w:hAnsi="Times New Roman" w:cs="Times New Roman"/>
+        </w:rPr>
+        <w:t>.</w:t>
+      </w:r>
+    </w:p>
+    <w:p>
+      <w:pPr>
+        <w:rPr>
+          <w:rFonts w:ascii="Times New Roman" w:hAnsi="Times New Roman" w:cs="Times New Roman"/>
+          <w:b/>
+          <w:bCs/>
+        </w:rPr>
+      </w:pPr>
+      <w:r>
+        <w:rPr>
+          <w:rFonts w:ascii="Times New Roman" w:hAnsi="Times New Roman" w:cs="Times New Roman"/>
+          <w:b/>
+          <w:bCs/>
+        </w:rPr>
+        <w:t>7</w:t>
+      </w:r>
+      <w:r>
+        <w:rPr>
+          <w:rFonts w:ascii="Times New Roman" w:hAnsi="Times New Roman" w:cs="Times New Roman"/>
+          <w:b/>
+          <w:bCs/>
+        </w:rPr>
+        <w:t>. PSA Domain Taxonomy</w:t>
+      </w:r>
+    </w:p>
+    <w:p>
+      <w:pPr>
+        <w:rPr>
+          <w:rFonts w:ascii="Times New Roman" w:hAnsi="Times New Roman" w:cs="Times New Roman"/>
+        </w:rPr>
+      </w:pPr>
+      <w:r>
+        <w:rPr>
+          <w:rFonts w:ascii="Times New Roman" w:hAnsi="Times New Roman" w:cs="Times New Roman"/>
+        </w:rPr>
+        <w:t xml:space="preserve">Each Public Service Announcement (PSA) in the dataset is classified into </w:t>
+      </w:r>
+      <w:r>
+        <w:rPr>
+          <w:rFonts w:ascii="Times New Roman" w:hAnsi="Times New Roman" w:cs="Times New Roman"/>
+          <w:b/>
+          <w:bCs/>
+        </w:rPr>
+        <w:t>one of five main domains</w:t>
+      </w:r>
+      <w:r>
+        <w:rPr>
+          <w:rFonts w:ascii="Times New Roman" w:hAnsi="Times New Roman" w:cs="Times New Roman"/>
+        </w:rPr>
+        <w:t xml:space="preserve">. Each domain is further divided into </w:t>
+      </w:r>
+      <w:r>
+        <w:rPr>
+          <w:rFonts w:ascii="Times New Roman" w:hAnsi="Times New Roman" w:cs="Times New Roman"/>
+          <w:b/>
+          <w:bCs/>
+        </w:rPr>
+        <w:t>five sub-categories</w:t>
+      </w:r>
+      <w:r>
+        <w:rPr>
+          <w:rFonts w:ascii="Times New Roman" w:hAnsi="Times New Roman" w:cs="Times New Roman"/>
+        </w:rPr>
+        <w:t xml:space="preserve">, resulting in a total of </w:t>
+      </w:r>
+      <w:r>
+        <w:rPr>
+          <w:rFonts w:ascii="Times New Roman" w:hAnsi="Times New Roman" w:cs="Times New Roman"/>
+          <w:b/>
+          <w:bCs/>
+        </w:rPr>
+        <w:t>25 domain–sub-category combinations</w:t>
+      </w:r>
+      <w:r>
+        <w:rPr>
+          <w:rFonts w:ascii="Times New Roman" w:hAnsi="Times New Roman" w:cs="Times New Roman"/>
+        </w:rPr>
+        <w:t>.</w:t>
+      </w:r>
+    </w:p>
+    <w:tbl>
+      <w:tblPr>
+        <w:tblW w:w="0" w:type="auto"/>
+        <w:tblCellSpacing w:w="15" w:type="dxa"/>
+        <w:tblCellMar>
+          <w:top w:w="15" w:type="dxa"/>
+          <w:left w:w="15" w:type="dxa"/>
+          <w:bottom w:w="15" w:type="dxa"/>
+          <w:right w:w="15" w:type="dxa"/>
+        </w:tblCellMar>
+        <w:tblLook w:val="04A0" w:firstRow="1" w:lastRow="0" w:firstColumn="1" w:lastColumn="0" w:noHBand="0" w:noVBand="1"/>
+      </w:tblPr>
+      <w:tblGrid>
+        <w:gridCol w:w="1705"/>
+        <w:gridCol w:w="7655"/>
+      </w:tblGrid>
+      <w:tr>
+        <w:trPr>
+          <w:tblHeader/>
+          <w:tblCellSpacing w:w="15" w:type="dxa"/>
+        </w:trPr>
+        <w:tc>
+          <w:tcPr>
+            <w:tcW w:w="0" w:type="auto"/>
+            <w:vAlign w:val="center"/>
+            <w:hideMark/>
+          </w:tcPr>
+          <w:p>
+            <w:pPr>
+              <w:rPr>
+                <w:rFonts w:ascii="Times New Roman" w:hAnsi="Times New Roman" w:cs="Times New Roman"/>
+                <w:b/>
+                <w:bCs/>
+              </w:rPr>
+            </w:pPr>
+            <w:r>
+              <w:rPr>
+                <w:rFonts w:ascii="Times New Roman" w:hAnsi="Times New Roman" w:cs="Times New Roman"/>
+                <w:b/>
+                <w:bCs/>
+              </w:rPr>
+              <w:t>Domain</w:t>
             </w:r>
           </w:p>
         </w:tc>
@@ -1662,41 +2094,252 @@
             <w:pPr>
               <w:rPr>
                 <w:rFonts w:ascii="Times New Roman" w:hAnsi="Times New Roman" w:cs="Times New Roman"/>
+                <w:b/>
+                <w:bCs/>
               </w:rPr>
             </w:pPr>
             <w:r>
               <w:rPr>
                 <w:rFonts w:ascii="Times New Roman" w:hAnsi="Times New Roman" w:cs="Times New Roman"/>
-              </w:rPr>
-              <w:t xml:space="preserve">A </w:t>
-            </w:r>
-            <w:proofErr w:type="spellStart"/>
-            <w:r>
-              <w:rPr>
-                <w:rFonts w:ascii="Times New Roman" w:hAnsi="Times New Roman" w:cs="Times New Roman"/>
-              </w:rPr>
-              <w:t>KSh</w:t>
-            </w:r>
-            <w:proofErr w:type="spellEnd"/>
-            <w:r>
-              <w:rPr>
-                <w:rFonts w:ascii="Times New Roman" w:hAnsi="Times New Roman" w:cs="Times New Roman"/>
-              </w:rPr>
-              <w:t xml:space="preserve">. 34.4 billion </w:t>
-            </w:r>
-            <w:proofErr w:type="gramStart"/>
-            <w:r>
-              <w:rPr>
-                <w:rFonts w:ascii="Times New Roman" w:hAnsi="Times New Roman" w:cs="Times New Roman"/>
-              </w:rPr>
-              <w:t>program</w:t>
-            </w:r>
-            <w:proofErr w:type="gramEnd"/>
-            <w:r>
-              <w:rPr>
-                <w:rFonts w:ascii="Times New Roman" w:hAnsi="Times New Roman" w:cs="Times New Roman"/>
-              </w:rPr>
-              <w:t xml:space="preserve"> has been launched to enhance climate resilience, food security, and sustainable livelihoods. Stakeholders in agriculture are encouraged to participate.</w:t>
+                <w:b/>
+                <w:bCs/>
+              </w:rPr>
+              <w:t>Sub-Categories</w:t>
+            </w:r>
+          </w:p>
+        </w:tc>
+      </w:tr>
+      <w:tr>
+        <w:trPr>
+          <w:tblCellSpacing w:w="15" w:type="dxa"/>
+        </w:trPr>
+        <w:tc>
+          <w:tcPr>
+            <w:tcW w:w="0" w:type="auto"/>
+            <w:vAlign w:val="center"/>
+            <w:hideMark/>
+          </w:tcPr>
+          <w:p>
+            <w:pPr>
+              <w:rPr>
+                <w:rFonts w:ascii="Times New Roman" w:hAnsi="Times New Roman" w:cs="Times New Roman"/>
+              </w:rPr>
+            </w:pPr>
+            <w:r>
+              <w:rPr>
+                <w:rFonts w:ascii="Times New Roman" w:hAnsi="Times New Roman" w:cs="Times New Roman"/>
+                <w:b/>
+                <w:bCs/>
+              </w:rPr>
+              <w:t>Health</w:t>
+            </w:r>
+          </w:p>
+        </w:tc>
+        <w:tc>
+          <w:tcPr>
+            <w:tcW w:w="0" w:type="auto"/>
+            <w:vAlign w:val="center"/>
+            <w:hideMark/>
+          </w:tcPr>
+          <w:p>
+            <w:pPr>
+              <w:rPr>
+                <w:rFonts w:ascii="Times New Roman" w:hAnsi="Times New Roman" w:cs="Times New Roman"/>
+              </w:rPr>
+            </w:pPr>
+            <w:r>
+              <w:rPr>
+                <w:rFonts w:ascii="Times New Roman" w:hAnsi="Times New Roman" w:cs="Times New Roman"/>
+              </w:rPr>
+              <w:t>Disease Prevention and Control; Maternal and Child Health; Public Health Campaigns; Mental Health Awareness; Healthcare Access</w:t>
+            </w:r>
+          </w:p>
+        </w:tc>
+      </w:tr>
+      <w:tr>
+        <w:trPr>
+          <w:tblCellSpacing w:w="15" w:type="dxa"/>
+        </w:trPr>
+        <w:tc>
+          <w:tcPr>
+            <w:tcW w:w="0" w:type="auto"/>
+            <w:vAlign w:val="center"/>
+            <w:hideMark/>
+          </w:tcPr>
+          <w:p>
+            <w:pPr>
+              <w:rPr>
+                <w:rFonts w:ascii="Times New Roman" w:hAnsi="Times New Roman" w:cs="Times New Roman"/>
+              </w:rPr>
+            </w:pPr>
+            <w:r>
+              <w:rPr>
+                <w:rFonts w:ascii="Times New Roman" w:hAnsi="Times New Roman" w:cs="Times New Roman"/>
+                <w:b/>
+                <w:bCs/>
+              </w:rPr>
+              <w:t>Agriculture</w:t>
+            </w:r>
+          </w:p>
+        </w:tc>
+        <w:tc>
+          <w:tcPr>
+            <w:tcW w:w="0" w:type="auto"/>
+            <w:vAlign w:val="center"/>
+            <w:hideMark/>
+          </w:tcPr>
+          <w:p>
+            <w:pPr>
+              <w:rPr>
+                <w:rFonts w:ascii="Times New Roman" w:hAnsi="Times New Roman" w:cs="Times New Roman"/>
+              </w:rPr>
+            </w:pPr>
+            <w:r>
+              <w:rPr>
+                <w:rFonts w:ascii="Times New Roman" w:hAnsi="Times New Roman" w:cs="Times New Roman"/>
+              </w:rPr>
+              <w:t>Crop Production; Livestock Management; Agribusiness and Market Access; Sustainable Farming; Agricultural Training</w:t>
+            </w:r>
+          </w:p>
+        </w:tc>
+      </w:tr>
+      <w:tr>
+        <w:trPr>
+          <w:tblCellSpacing w:w="15" w:type="dxa"/>
+        </w:trPr>
+        <w:tc>
+          <w:tcPr>
+            <w:tcW w:w="0" w:type="auto"/>
+            <w:vAlign w:val="center"/>
+            <w:hideMark/>
+          </w:tcPr>
+          <w:p>
+            <w:pPr>
+              <w:rPr>
+                <w:rFonts w:ascii="Times New Roman" w:hAnsi="Times New Roman" w:cs="Times New Roman"/>
+              </w:rPr>
+            </w:pPr>
+            <w:r>
+              <w:rPr>
+                <w:rFonts w:ascii="Times New Roman" w:hAnsi="Times New Roman" w:cs="Times New Roman"/>
+                <w:b/>
+                <w:bCs/>
+              </w:rPr>
+              <w:t>Education</w:t>
+            </w:r>
+          </w:p>
+        </w:tc>
+        <w:tc>
+          <w:tcPr>
+            <w:tcW w:w="0" w:type="auto"/>
+            <w:vAlign w:val="center"/>
+            <w:hideMark/>
+          </w:tcPr>
+          <w:p>
+            <w:pPr>
+              <w:rPr>
+                <w:rFonts w:ascii="Times New Roman" w:hAnsi="Times New Roman" w:cs="Times New Roman"/>
+              </w:rPr>
+            </w:pPr>
+            <w:r>
+              <w:rPr>
+                <w:rFonts w:ascii="Times New Roman" w:hAnsi="Times New Roman" w:cs="Times New Roman"/>
+              </w:rPr>
+              <w:t>Access to Education; Vocational Training; Civic Education; Educational Resources; School Safety and Inclusion</w:t>
+            </w:r>
+          </w:p>
+        </w:tc>
+      </w:tr>
+      <w:tr>
+        <w:trPr>
+          <w:tblCellSpacing w:w="15" w:type="dxa"/>
+        </w:trPr>
+        <w:tc>
+          <w:tcPr>
+            <w:tcW w:w="0" w:type="auto"/>
+            <w:vAlign w:val="center"/>
+            <w:hideMark/>
+          </w:tcPr>
+          <w:p>
+            <w:pPr>
+              <w:rPr>
+                <w:rFonts w:ascii="Times New Roman" w:hAnsi="Times New Roman" w:cs="Times New Roman"/>
+              </w:rPr>
+            </w:pPr>
+            <w:r>
+              <w:rPr>
+                <w:rFonts w:ascii="Times New Roman" w:hAnsi="Times New Roman" w:cs="Times New Roman"/>
+                <w:b/>
+                <w:bCs/>
+              </w:rPr>
+              <w:t>Security and Safety</w:t>
+            </w:r>
+          </w:p>
+        </w:tc>
+        <w:tc>
+          <w:tcPr>
+            <w:tcW w:w="0" w:type="auto"/>
+            <w:vAlign w:val="center"/>
+            <w:hideMark/>
+          </w:tcPr>
+          <w:p>
+            <w:pPr>
+              <w:rPr>
+                <w:rFonts w:ascii="Times New Roman" w:hAnsi="Times New Roman" w:cs="Times New Roman"/>
+              </w:rPr>
+            </w:pPr>
+            <w:r>
+              <w:rPr>
+                <w:rFonts w:ascii="Times New Roman" w:hAnsi="Times New Roman" w:cs="Times New Roman"/>
+              </w:rPr>
+              <w:t>Public Safety Awareness; Crime Prevention; National Security; Gender-Based Violence; Cybersecurity</w:t>
+            </w:r>
+          </w:p>
+        </w:tc>
+      </w:tr>
+      <w:tr>
+        <w:trPr>
+          <w:tblCellSpacing w:w="15" w:type="dxa"/>
+        </w:trPr>
+        <w:tc>
+          <w:tcPr>
+            <w:tcW w:w="0" w:type="auto"/>
+            <w:vAlign w:val="center"/>
+            <w:hideMark/>
+          </w:tcPr>
+          <w:p>
+            <w:pPr>
+              <w:rPr>
+                <w:rFonts w:ascii="Times New Roman" w:hAnsi="Times New Roman" w:cs="Times New Roman"/>
+              </w:rPr>
+            </w:pPr>
+            <w:r>
+              <w:rPr>
+                <w:rFonts w:ascii="Times New Roman" w:hAnsi="Times New Roman" w:cs="Times New Roman"/>
+                <w:b/>
+                <w:bCs/>
+              </w:rPr>
+              <w:t>Governance</w:t>
+            </w:r>
+          </w:p>
+        </w:tc>
+        <w:tc>
+          <w:tcPr>
+            <w:tcW w:w="0" w:type="auto"/>
+            <w:vAlign w:val="center"/>
+            <w:hideMark/>
+          </w:tcPr>
+          <w:p>
+            <w:pPr>
+              <w:rPr>
+                <w:rFonts w:ascii="Times New Roman" w:hAnsi="Times New Roman" w:cs="Times New Roman"/>
+              </w:rPr>
+            </w:pPr>
+            <w:r>
+              <w:rPr>
+                <w:rFonts w:ascii="Times New Roman" w:hAnsi="Times New Roman" w:cs="Times New Roman"/>
+              </w:rPr>
+              <w:t>Anti-Corruption Initiatives; Public Participation; Elections and Voter Education; Public Service Delivery; Devolution and Local Governance</w:t>
             </w:r>
           </w:p>
         </w:tc>
@@ -1706,414 +2349,211 @@
       <w:pPr>
         <w:rPr>
           <w:rFonts w:ascii="Times New Roman" w:hAnsi="Times New Roman" w:cs="Times New Roman"/>
-        </w:rPr>
-      </w:pPr>
-      <w:r>
-        <w:rPr>
-          <w:rFonts w:ascii="Times New Roman" w:hAnsi="Times New Roman" w:cs="Times New Roman"/>
-        </w:rPr>
-        <w:t xml:space="preserve">These examples demonstrate the </w:t>
-      </w:r>
-      <w:r>
-        <w:rPr>
-          <w:rFonts w:ascii="Times New Roman" w:hAnsi="Times New Roman" w:cs="Times New Roman"/>
-          <w:b/>
-          <w:bCs/>
-        </w:rPr>
-        <w:t>action-oriented and public-interest nature</w:t>
-      </w:r>
-      <w:r>
-        <w:rPr>
-          <w:rFonts w:ascii="Times New Roman" w:hAnsi="Times New Roman" w:cs="Times New Roman"/>
-        </w:rPr>
-        <w:t xml:space="preserve"> of the collected messages. Similar PSA records were collected across all five target domains to provide diverse material for subsequent </w:t>
-      </w:r>
-      <w:r>
-        <w:rPr>
-          <w:rFonts w:ascii="Times New Roman" w:hAnsi="Times New Roman" w:cs="Times New Roman"/>
-          <w:b/>
-          <w:bCs/>
-        </w:rPr>
-        <w:t>data processing, synthetic data generation, translation, and machine-learning model training</w:t>
-      </w:r>
-      <w:r>
-        <w:rPr>
-          <w:rFonts w:ascii="Times New Roman" w:hAnsi="Times New Roman" w:cs="Times New Roman"/>
-        </w:rPr>
-        <w:t xml:space="preserve">. The project documentation also confirms that the merged dataset contained </w:t>
-      </w:r>
-      <w:r>
-        <w:rPr>
-          <w:rFonts w:ascii="Times New Roman" w:hAnsi="Times New Roman" w:cs="Times New Roman"/>
-          <w:b/>
-          <w:bCs/>
-        </w:rPr>
-        <w:t>6,236 real scraped records</w:t>
-      </w:r>
-      <w:r>
-        <w:rPr>
-          <w:rFonts w:ascii="Times New Roman" w:hAnsi="Times New Roman" w:cs="Times New Roman"/>
-        </w:rPr>
-        <w:t xml:space="preserve"> across these domains.</w:t>
-      </w:r>
-    </w:p>
-    <w:p>
-      <w:pPr>
-        <w:rPr>
-          <w:rFonts w:ascii="Times New Roman" w:hAnsi="Times New Roman" w:cs="Times New Roman"/>
-          <w:b/>
-          <w:bCs/>
-        </w:rPr>
-      </w:pPr>
-      <w:r>
-        <w:rPr>
-          <w:rFonts w:ascii="Times New Roman" w:hAnsi="Times New Roman" w:cs="Times New Roman"/>
-        </w:rPr>
-        <w:t xml:space="preserve">7. </w:t>
-      </w:r>
-      <w:r>
-        <w:rPr>
-          <w:rFonts w:ascii="Times New Roman" w:hAnsi="Times New Roman" w:cs="Times New Roman"/>
-          <w:b/>
-          <w:bCs/>
-        </w:rPr>
-        <w:t>Translation and Multilingual Data Preparation</w:t>
-      </w:r>
-    </w:p>
-    <w:p>
-      <w:pPr>
-        <w:rPr>
-          <w:rFonts w:ascii="Times New Roman" w:hAnsi="Times New Roman" w:cs="Times New Roman"/>
-        </w:rPr>
-      </w:pPr>
-      <w:r>
-        <w:rPr>
-          <w:rFonts w:ascii="Times New Roman" w:hAnsi="Times New Roman" w:cs="Times New Roman"/>
-        </w:rPr>
-        <w:t xml:space="preserve">After collecting and curating the PSA data, the team proceeded to develop the </w:t>
-      </w:r>
-      <w:r>
-        <w:rPr>
-          <w:rFonts w:ascii="Times New Roman" w:hAnsi="Times New Roman" w:cs="Times New Roman"/>
-          <w:b/>
-          <w:bCs/>
-        </w:rPr>
-        <w:t>multilingual component</w:t>
-      </w:r>
-      <w:r>
-        <w:rPr>
-          <w:rFonts w:ascii="Times New Roman" w:hAnsi="Times New Roman" w:cs="Times New Roman"/>
-        </w:rPr>
-        <w:t xml:space="preserve"> of the dataset. The initial scraped dataset contained English PSAs together with Kiswahili translations for a substantial proportion of the records, while the availability of </w:t>
-      </w:r>
-      <w:proofErr w:type="spellStart"/>
-      <w:r>
-        <w:rPr>
-          <w:rFonts w:ascii="Times New Roman" w:hAnsi="Times New Roman" w:cs="Times New Roman"/>
-        </w:rPr>
-        <w:t>Ekegusii</w:t>
-      </w:r>
-      <w:proofErr w:type="spellEnd"/>
-      <w:r>
-        <w:rPr>
-          <w:rFonts w:ascii="Times New Roman" w:hAnsi="Times New Roman" w:cs="Times New Roman"/>
-        </w:rPr>
-        <w:t xml:space="preserve"> and other indigenous-language translations was limited.</w:t>
-      </w:r>
-    </w:p>
-    <w:p>
-      <w:pPr>
-        <w:rPr>
-          <w:rFonts w:ascii="Times New Roman" w:hAnsi="Times New Roman" w:cs="Times New Roman"/>
-        </w:rPr>
-      </w:pPr>
-      <w:r>
-        <w:rPr>
-          <w:rFonts w:ascii="Times New Roman" w:hAnsi="Times New Roman" w:cs="Times New Roman"/>
-        </w:rPr>
-        <w:t xml:space="preserve">To increase the availability of </w:t>
-      </w:r>
-      <w:proofErr w:type="spellStart"/>
-      <w:r>
-        <w:rPr>
-          <w:rFonts w:ascii="Times New Roman" w:hAnsi="Times New Roman" w:cs="Times New Roman"/>
-        </w:rPr>
-        <w:t>Ekegusii</w:t>
-      </w:r>
-      <w:proofErr w:type="spellEnd"/>
-      <w:r>
-        <w:rPr>
-          <w:rFonts w:ascii="Times New Roman" w:hAnsi="Times New Roman" w:cs="Times New Roman"/>
-        </w:rPr>
-        <w:t xml:space="preserve"> data, the team used the collected and expanded PSA dataset as the source material for </w:t>
-      </w:r>
-      <w:r>
-        <w:rPr>
-          <w:rFonts w:ascii="Times New Roman" w:hAnsi="Times New Roman" w:cs="Times New Roman"/>
-          <w:b/>
-          <w:bCs/>
-        </w:rPr>
-        <w:t>English-to-</w:t>
-      </w:r>
-      <w:proofErr w:type="spellStart"/>
-      <w:r>
-        <w:rPr>
-          <w:rFonts w:ascii="Times New Roman" w:hAnsi="Times New Roman" w:cs="Times New Roman"/>
-          <w:b/>
-          <w:bCs/>
-        </w:rPr>
-        <w:t>Ekegusii</w:t>
-      </w:r>
-      <w:proofErr w:type="spellEnd"/>
-      <w:r>
-        <w:rPr>
-          <w:rFonts w:ascii="Times New Roman" w:hAnsi="Times New Roman" w:cs="Times New Roman"/>
-          <w:b/>
-          <w:bCs/>
-        </w:rPr>
-        <w:t xml:space="preserve"> translation</w:t>
-      </w:r>
-      <w:r>
-        <w:rPr>
-          <w:rFonts w:ascii="Times New Roman" w:hAnsi="Times New Roman" w:cs="Times New Roman"/>
-        </w:rPr>
-        <w:t xml:space="preserve">. An </w:t>
-      </w:r>
-      <w:r>
-        <w:rPr>
-          <w:rFonts w:ascii="Times New Roman" w:hAnsi="Times New Roman" w:cs="Times New Roman"/>
-          <w:b/>
-          <w:bCs/>
-        </w:rPr>
-        <w:t>LLM-based translation approach using few-shot prompting</w:t>
-      </w:r>
-      <w:r>
-        <w:rPr>
-          <w:rFonts w:ascii="Times New Roman" w:hAnsi="Times New Roman" w:cs="Times New Roman"/>
-        </w:rPr>
-        <w:t xml:space="preserve"> was applied to generate </w:t>
-      </w:r>
-      <w:proofErr w:type="spellStart"/>
-      <w:r>
-        <w:rPr>
-          <w:rFonts w:ascii="Times New Roman" w:hAnsi="Times New Roman" w:cs="Times New Roman"/>
-        </w:rPr>
-        <w:t>Ekegusii</w:t>
-      </w:r>
-      <w:proofErr w:type="spellEnd"/>
-      <w:r>
-        <w:rPr>
-          <w:rFonts w:ascii="Times New Roman" w:hAnsi="Times New Roman" w:cs="Times New Roman"/>
-        </w:rPr>
-        <w:t xml:space="preserve"> translations. The few-shot approach was used to provide the translation model with examples and context appropriate to the PSA domain and the </w:t>
-      </w:r>
-      <w:proofErr w:type="spellStart"/>
-      <w:r>
-        <w:rPr>
-          <w:rFonts w:ascii="Times New Roman" w:hAnsi="Times New Roman" w:cs="Times New Roman"/>
-        </w:rPr>
-        <w:t>Ekegusii</w:t>
-      </w:r>
-      <w:proofErr w:type="spellEnd"/>
-      <w:r>
-        <w:rPr>
-          <w:rFonts w:ascii="Times New Roman" w:hAnsi="Times New Roman" w:cs="Times New Roman"/>
-        </w:rPr>
-        <w:t xml:space="preserve"> language.</w:t>
-      </w:r>
-    </w:p>
-    <w:p>
-      <w:pPr>
-        <w:rPr>
-          <w:rFonts w:ascii="Times New Roman" w:hAnsi="Times New Roman" w:cs="Times New Roman"/>
-        </w:rPr>
-      </w:pPr>
-      <w:r>
-        <w:rPr>
-          <w:rFonts w:ascii="Times New Roman" w:hAnsi="Times New Roman" w:cs="Times New Roman"/>
-        </w:rPr>
-        <w:t xml:space="preserve">The generated </w:t>
-      </w:r>
-      <w:proofErr w:type="spellStart"/>
-      <w:r>
-        <w:rPr>
-          <w:rFonts w:ascii="Times New Roman" w:hAnsi="Times New Roman" w:cs="Times New Roman"/>
-        </w:rPr>
-        <w:t>Ekegusii</w:t>
-      </w:r>
-      <w:proofErr w:type="spellEnd"/>
-      <w:r>
-        <w:rPr>
-          <w:rFonts w:ascii="Times New Roman" w:hAnsi="Times New Roman" w:cs="Times New Roman"/>
-        </w:rPr>
-        <w:t xml:space="preserve"> translations were then subjected to </w:t>
-      </w:r>
-      <w:r>
-        <w:rPr>
-          <w:rFonts w:ascii="Times New Roman" w:hAnsi="Times New Roman" w:cs="Times New Roman"/>
-          <w:b/>
-          <w:bCs/>
-        </w:rPr>
-        <w:t xml:space="preserve">manual validation by </w:t>
-      </w:r>
-      <w:proofErr w:type="spellStart"/>
-      <w:r>
-        <w:rPr>
-          <w:rFonts w:ascii="Times New Roman" w:hAnsi="Times New Roman" w:cs="Times New Roman"/>
-          <w:b/>
-          <w:bCs/>
-        </w:rPr>
-        <w:t>Ekegusii</w:t>
-      </w:r>
-      <w:proofErr w:type="spellEnd"/>
-      <w:r>
-        <w:rPr>
-          <w:rFonts w:ascii="Times New Roman" w:hAnsi="Times New Roman" w:cs="Times New Roman"/>
-          <w:b/>
-          <w:bCs/>
-        </w:rPr>
-        <w:t xml:space="preserve"> speakers</w:t>
-      </w:r>
-      <w:r>
-        <w:rPr>
-          <w:rFonts w:ascii="Times New Roman" w:hAnsi="Times New Roman" w:cs="Times New Roman"/>
-        </w:rPr>
-        <w:t xml:space="preserve">. This step was important because automated evaluation resources for </w:t>
-      </w:r>
-      <w:proofErr w:type="spellStart"/>
-      <w:r>
-        <w:rPr>
-          <w:rFonts w:ascii="Times New Roman" w:hAnsi="Times New Roman" w:cs="Times New Roman"/>
-        </w:rPr>
-        <w:t>Ekegusii</w:t>
-      </w:r>
-      <w:proofErr w:type="spellEnd"/>
-      <w:r>
-        <w:rPr>
-          <w:rFonts w:ascii="Times New Roman" w:hAnsi="Times New Roman" w:cs="Times New Roman"/>
-        </w:rPr>
-        <w:t xml:space="preserve"> are limited. Native-speaker review was therefore used to check </w:t>
-      </w:r>
-      <w:r>
-        <w:rPr>
-          <w:rFonts w:ascii="Times New Roman" w:hAnsi="Times New Roman" w:cs="Times New Roman"/>
-          <w:b/>
-          <w:bCs/>
-        </w:rPr>
-        <w:t>linguistic accuracy, meaning, cultural appropriateness, and consistency</w:t>
-      </w:r>
-      <w:r>
-        <w:rPr>
-          <w:rFonts w:ascii="Times New Roman" w:hAnsi="Times New Roman" w:cs="Times New Roman"/>
-        </w:rPr>
-        <w:t xml:space="preserve"> of the translations.</w:t>
-      </w:r>
-    </w:p>
-    <w:p>
-      <w:pPr>
-        <w:rPr>
-          <w:rFonts w:ascii="Times New Roman" w:hAnsi="Times New Roman" w:cs="Times New Roman"/>
-        </w:rPr>
-      </w:pPr>
-      <w:r>
-        <w:rPr>
-          <w:rFonts w:ascii="Times New Roman" w:hAnsi="Times New Roman" w:cs="Times New Roman"/>
-        </w:rPr>
-        <w:t>The resulting workflow can therefore be summarized as:</w:t>
-      </w:r>
-    </w:p>
-    <w:p>
-      <w:pPr>
-        <w:rPr>
-          <w:rFonts w:ascii="Times New Roman" w:hAnsi="Times New Roman" w:cs="Times New Roman"/>
-        </w:rPr>
-      </w:pPr>
-      <w:r>
-        <w:rPr>
-          <w:rFonts w:ascii="Times New Roman" w:hAnsi="Times New Roman" w:cs="Times New Roman"/>
-          <w:b/>
-          <w:bCs/>
-        </w:rPr>
-        <w:t xml:space="preserve">Real PSA collection → Data cleaning → Bootstrapping/synthetic expansion → English PSA dataset → LLM few-shot translation → </w:t>
-      </w:r>
-      <w:proofErr w:type="spellStart"/>
-      <w:r>
-        <w:rPr>
-          <w:rFonts w:ascii="Times New Roman" w:hAnsi="Times New Roman" w:cs="Times New Roman"/>
-          <w:b/>
-          <w:bCs/>
-        </w:rPr>
-        <w:t>Ekegusii</w:t>
-      </w:r>
-      <w:proofErr w:type="spellEnd"/>
-      <w:r>
-        <w:rPr>
-          <w:rFonts w:ascii="Times New Roman" w:hAnsi="Times New Roman" w:cs="Times New Roman"/>
-          <w:b/>
-          <w:bCs/>
-        </w:rPr>
-        <w:t xml:space="preserve"> translation → Native-speaker validation → Multilingual dataset</w:t>
-      </w:r>
-    </w:p>
-    <w:p>
-      <w:pPr>
-        <w:rPr>
-          <w:rFonts w:ascii="Times New Roman" w:hAnsi="Times New Roman" w:cs="Times New Roman"/>
-        </w:rPr>
-      </w:pPr>
-      <w:r>
-        <w:rPr>
-          <w:rFonts w:ascii="Times New Roman" w:hAnsi="Times New Roman" w:cs="Times New Roman"/>
-        </w:rPr>
-        <w:t xml:space="preserve">This process provided the multilingual training material required for the later machine-translation experiments and supported the project's focus on </w:t>
-      </w:r>
-      <w:r>
-        <w:rPr>
-          <w:rFonts w:ascii="Times New Roman" w:hAnsi="Times New Roman" w:cs="Times New Roman"/>
-          <w:b/>
-          <w:bCs/>
-        </w:rPr>
-        <w:t xml:space="preserve">English/Kiswahili and under-resourced Kenyan languages, particularly </w:t>
-      </w:r>
-      <w:proofErr w:type="spellStart"/>
-      <w:r>
-        <w:rPr>
-          <w:rFonts w:ascii="Times New Roman" w:hAnsi="Times New Roman" w:cs="Times New Roman"/>
-          <w:b/>
-          <w:bCs/>
-        </w:rPr>
-        <w:t>Ekegusii</w:t>
-      </w:r>
-      <w:proofErr w:type="spellEnd"/>
-      <w:r>
-        <w:rPr>
-          <w:rFonts w:ascii="Times New Roman" w:hAnsi="Times New Roman" w:cs="Times New Roman"/>
-        </w:rPr>
-        <w:t>.</w:t>
-      </w:r>
-    </w:p>
-    <w:p>
-      <w:pPr>
-        <w:rPr>
-          <w:rFonts w:ascii="Times New Roman" w:hAnsi="Times New Roman" w:cs="Times New Roman"/>
-        </w:rPr>
-      </w:pPr>
-    </w:p>
-    <w:p>
-      <w:pPr>
-        <w:rPr>
-          <w:rFonts w:ascii="Times New Roman" w:hAnsi="Times New Roman" w:cs="Times New Roman"/>
-          <w:b/>
-          <w:bCs/>
-        </w:rPr>
-      </w:pPr>
-      <w:r>
-        <w:rPr>
-          <w:rFonts w:ascii="Times New Roman" w:hAnsi="Times New Roman" w:cs="Times New Roman"/>
-          <w:b/>
-          <w:bCs/>
-        </w:rPr>
-        <w:t>7. Challenges Faced During Week 1</w:t>
+          <w:b/>
+          <w:bCs/>
+        </w:rPr>
+      </w:pPr>
+      <w:r>
+        <w:rPr>
+          <w:rFonts w:ascii="Times New Roman" w:hAnsi="Times New Roman" w:cs="Times New Roman"/>
+          <w:b/>
+          <w:bCs/>
+        </w:rPr>
+        <w:t>Description of the Taxonomy</w:t>
+      </w:r>
+    </w:p>
+    <w:p>
+      <w:pPr>
+        <w:rPr>
+          <w:rFonts w:ascii="Times New Roman" w:hAnsi="Times New Roman" w:cs="Times New Roman"/>
+        </w:rPr>
+      </w:pPr>
+      <w:r>
+        <w:rPr>
+          <w:rFonts w:ascii="Times New Roman" w:hAnsi="Times New Roman" w:cs="Times New Roman"/>
+        </w:rPr>
+        <w:t xml:space="preserve">The </w:t>
+      </w:r>
+      <w:proofErr w:type="gramStart"/>
+      <w:r>
+        <w:rPr>
+          <w:rFonts w:ascii="Times New Roman" w:hAnsi="Times New Roman" w:cs="Times New Roman"/>
+          <w:b/>
+          <w:bCs/>
+        </w:rPr>
+        <w:t>Health</w:t>
+      </w:r>
+      <w:proofErr w:type="gramEnd"/>
+      <w:r>
+        <w:rPr>
+          <w:rFonts w:ascii="Times New Roman" w:hAnsi="Times New Roman" w:cs="Times New Roman"/>
+        </w:rPr>
+        <w:t xml:space="preserve"> domain covers PSAs related to disease prevention, maternal and child health, public health campaigns, mental health, and access to healthcare. The </w:t>
+      </w:r>
+      <w:proofErr w:type="gramStart"/>
+      <w:r>
+        <w:rPr>
+          <w:rFonts w:ascii="Times New Roman" w:hAnsi="Times New Roman" w:cs="Times New Roman"/>
+          <w:b/>
+          <w:bCs/>
+        </w:rPr>
+        <w:t>Agriculture</w:t>
+      </w:r>
+      <w:proofErr w:type="gramEnd"/>
+      <w:r>
+        <w:rPr>
+          <w:rFonts w:ascii="Times New Roman" w:hAnsi="Times New Roman" w:cs="Times New Roman"/>
+        </w:rPr>
+        <w:t xml:space="preserve"> domain focuses on crop production, livestock management, agribusiness, sustainable farming practices, and agricultural training.</w:t>
+      </w:r>
+    </w:p>
+    <w:p>
+      <w:pPr>
+        <w:rPr>
+          <w:rFonts w:ascii="Times New Roman" w:hAnsi="Times New Roman" w:cs="Times New Roman"/>
+        </w:rPr>
+      </w:pPr>
+      <w:r>
+        <w:rPr>
+          <w:rFonts w:ascii="Times New Roman" w:hAnsi="Times New Roman" w:cs="Times New Roman"/>
+        </w:rPr>
+        <w:t xml:space="preserve">The </w:t>
+      </w:r>
+      <w:r>
+        <w:rPr>
+          <w:rFonts w:ascii="Times New Roman" w:hAnsi="Times New Roman" w:cs="Times New Roman"/>
+          <w:b/>
+          <w:bCs/>
+        </w:rPr>
+        <w:t>Education</w:t>
+      </w:r>
+      <w:r>
+        <w:rPr>
+          <w:rFonts w:ascii="Times New Roman" w:hAnsi="Times New Roman" w:cs="Times New Roman"/>
+        </w:rPr>
+        <w:t xml:space="preserve"> domain includes messages concerning access to education, vocational training, civic education, educational resources, and school safety and inclusion. </w:t>
+      </w:r>
+      <w:r>
+        <w:rPr>
+          <w:rFonts w:ascii="Times New Roman" w:hAnsi="Times New Roman" w:cs="Times New Roman"/>
+          <w:b/>
+          <w:bCs/>
+        </w:rPr>
+        <w:t>Security and Safety</w:t>
+      </w:r>
+      <w:r>
+        <w:rPr>
+          <w:rFonts w:ascii="Times New Roman" w:hAnsi="Times New Roman" w:cs="Times New Roman"/>
+        </w:rPr>
+        <w:t xml:space="preserve"> </w:t>
+      </w:r>
+      <w:proofErr w:type="gramStart"/>
+      <w:r>
+        <w:rPr>
+          <w:rFonts w:ascii="Times New Roman" w:hAnsi="Times New Roman" w:cs="Times New Roman"/>
+        </w:rPr>
+        <w:t>covers</w:t>
+      </w:r>
+      <w:proofErr w:type="gramEnd"/>
+      <w:r>
+        <w:rPr>
+          <w:rFonts w:ascii="Times New Roman" w:hAnsi="Times New Roman" w:cs="Times New Roman"/>
+        </w:rPr>
+        <w:t xml:space="preserve"> public safety, crime prevention, national security, gender-based violence, and cybersecurity. Finally, the </w:t>
+      </w:r>
+      <w:r>
+        <w:rPr>
+          <w:rFonts w:ascii="Times New Roman" w:hAnsi="Times New Roman" w:cs="Times New Roman"/>
+          <w:b/>
+          <w:bCs/>
+        </w:rPr>
+        <w:t>Governance</w:t>
+      </w:r>
+      <w:r>
+        <w:rPr>
+          <w:rFonts w:ascii="Times New Roman" w:hAnsi="Times New Roman" w:cs="Times New Roman"/>
+        </w:rPr>
+        <w:t xml:space="preserve"> domain focuses on anti-corruption initiatives, public participation, elections and voter education, public service delivery, and devolution and local governance.</w:t>
+      </w:r>
+    </w:p>
+    <w:p>
+      <w:pPr>
+        <w:rPr>
+          <w:rFonts w:ascii="Times New Roman" w:hAnsi="Times New Roman" w:cs="Times New Roman"/>
+        </w:rPr>
+      </w:pPr>
+      <w:r>
+        <w:rPr>
+          <w:rFonts w:ascii="Times New Roman" w:hAnsi="Times New Roman" w:cs="Times New Roman"/>
+        </w:rPr>
+        <w:t xml:space="preserve">This taxonomy provides a consistent structure for </w:t>
+      </w:r>
+      <w:r>
+        <w:rPr>
+          <w:rFonts w:ascii="Times New Roman" w:hAnsi="Times New Roman" w:cs="Times New Roman"/>
+          <w:b/>
+          <w:bCs/>
+        </w:rPr>
+        <w:t>organizing, filtering, analyzing, and generating PSAs</w:t>
+      </w:r>
+      <w:r>
+        <w:rPr>
+          <w:rFonts w:ascii="Times New Roman" w:hAnsi="Times New Roman" w:cs="Times New Roman"/>
+        </w:rPr>
+        <w:t xml:space="preserve"> across </w:t>
+      </w:r>
+      <w:proofErr w:type="gramStart"/>
+      <w:r>
+        <w:rPr>
+          <w:rFonts w:ascii="Times New Roman" w:hAnsi="Times New Roman" w:cs="Times New Roman"/>
+        </w:rPr>
+        <w:t>the different</w:t>
+      </w:r>
+      <w:proofErr w:type="gramEnd"/>
+      <w:r>
+        <w:rPr>
+          <w:rFonts w:ascii="Times New Roman" w:hAnsi="Times New Roman" w:cs="Times New Roman"/>
+        </w:rPr>
+        <w:t xml:space="preserve"> areas of public interest.</w:t>
+      </w:r>
+    </w:p>
+    <w:p>
+      <w:pPr>
+        <w:rPr>
+          <w:rFonts w:ascii="Times New Roman" w:hAnsi="Times New Roman" w:cs="Times New Roman"/>
+        </w:rPr>
+      </w:pPr>
+    </w:p>
+    <w:p>
+      <w:pPr>
+        <w:rPr>
+          <w:rFonts w:ascii="Times New Roman" w:hAnsi="Times New Roman" w:cs="Times New Roman"/>
+        </w:rPr>
+      </w:pPr>
+    </w:p>
+    <w:p>
+      <w:pPr>
+        <w:rPr>
+          <w:rFonts w:ascii="Times New Roman" w:hAnsi="Times New Roman" w:cs="Times New Roman"/>
+          <w:b/>
+          <w:bCs/>
+        </w:rPr>
+      </w:pPr>
+      <w:r>
+        <w:rPr>
+          <w:rFonts w:ascii="Times New Roman" w:hAnsi="Times New Roman" w:cs="Times New Roman"/>
+          <w:b/>
+          <w:bCs/>
+        </w:rPr>
+        <w:t>8</w:t>
+      </w:r>
+      <w:r>
+        <w:rPr>
+          <w:rFonts w:ascii="Times New Roman" w:hAnsi="Times New Roman" w:cs="Times New Roman"/>
+          <w:b/>
+          <w:bCs/>
+        </w:rPr>
+        <w:t>. Challenges Faced During Week 1</w:t>
       </w:r>
     </w:p>
     <w:p>
@@ -3177,7 +3617,6 @@
     <w:next w:val="Normal"/>
     <w:link w:val="Heading2Char"/>
     <w:uiPriority w:val="9"/>
-    <w:semiHidden/>
     <w:unhideWhenUsed/>
     <w:qFormat/>
     <w:rsid w:val="00ED7194"/>
@@ -3392,7 +3831,6 @@
     <w:basedOn w:val="DefaultParagraphFont"/>
     <w:link w:val="Heading2"/>
     <w:uiPriority w:val="9"/>
-    <w:semiHidden/>
     <w:rsid w:val="00ED7194"/>
     <w:rPr>
       <w:rFonts w:asciiTheme="majorHAnsi" w:eastAsiaTheme="majorEastAsia" w:hAnsiTheme="majorHAnsi" w:cstheme="majorBidi"/>

</xml_diff>